<commit_message>
Add compact 2027 process file watches
</commit_message>
<xml_diff>
--- a/public/downloads/process-briefs/cnd-prose-brief.docx
+++ b/public/downloads/process-briefs/cnd-prose-brief.docx
@@ -93,7 +93,7 @@
           <w:i w:val="0"/>
           <w:sz w:val="22"/>
         </w:rPr>
-        <w:t>27 August 2026</w:t>
+        <w:t>28 August 2026</w:t>
       </w:r>
     </w:p>
     <w:p>
@@ -211,7 +211,7 @@
           <w:i w:val="0"/>
           <w:sz w:val="22"/>
         </w:rPr>
-        <w:t>CND does not have one recurring youth resolution. The clearest current youth-specific opening is the independent expert panel established by resolution 68/6: it must consult youth groups and its recommendations are due for discussion at CND70 in 2027.</w:t>
+        <w:t>CND does not have one recurring youth resolution. Two separate youth-specific openings are the annual UNODC Youth Forum and the independent expert panel established by resolution 68/6, which must consult youth groups and return to CND70 in 2027.</w:t>
       </w:r>
     </w:p>
     <w:p>
@@ -220,6 +220,46 @@
       </w:pPr>
       <w:r>
         <w:t>Recurring entry points</w:t>
+      </w:r>
+    </w:p>
+    <w:p>
+      <w:hyperlink r:id="rId9">
+        <w:r>
+          <w:rPr>
+            <w:rFonts w:ascii="Times New Roman" w:hAnsi="Times New Roman" w:eastAsia="Times New Roman"/>
+            <w:sz w:val="22"/>
+            <w:color w:val="0563C1"/>
+            <w:u w:val="single"/>
+          </w:rPr>
+          <w:t>Annual UNODC Youth Forum</w:t>
+        </w:r>
+      </w:hyperlink>
+      <w:r>
+        <w:rPr>
+          <w:rFonts w:ascii="Times New Roman" w:hAnsi="Times New Roman" w:eastAsia="Times New Roman"/>
+          <w:b/>
+          <w:i w:val="0"/>
+          <w:sz w:val="22"/>
+        </w:rPr>
+        <w:t xml:space="preserve"> — Nomination can begin in the previous summer · event around CND</w:t>
+      </w:r>
+      <w:r>
+        <w:rPr>
+          <w:rFonts w:ascii="Times New Roman" w:hAnsi="Times New Roman" w:eastAsia="Times New Roman"/>
+          <w:b w:val="0"/>
+          <w:i w:val="0"/>
+          <w:sz w:val="22"/>
+        </w:rPr>
+        <w:t>. UNODC organizes the Forum with ongoing support from the Government of the Russian Federation. It is not a UN Youth Delegate forum: Member States nominate participants through their Permanent Missions, UNODC selects them and they participate in their personal capacity. Some UN Youth Delegates have participated, but the official reports do not consistently identify UNYD status. The Forum produces a collective youth statement delivered to CND.</w:t>
+      </w:r>
+      <w:r>
+        <w:rPr>
+          <w:rFonts w:ascii="Times New Roman" w:hAnsi="Times New Roman" w:eastAsia="Times New Roman"/>
+          <w:b w:val="0"/>
+          <w:i/>
+          <w:sz w:val="22"/>
+        </w:rPr>
+        <w:t xml:space="preserve"> Status: Annual adjacent participation route; 2027 nomination pending.</w:t>
       </w:r>
     </w:p>
     <w:p>
@@ -268,7 +308,7 @@
         </w:rPr>
         <w:t xml:space="preserve"> </w:t>
       </w:r>
-      <w:hyperlink r:id="rId9">
+      <w:hyperlink r:id="rId10">
         <w:r>
           <w:rPr>
             <w:rFonts w:ascii="Times New Roman" w:hAnsi="Times New Roman" w:eastAsia="Times New Roman"/>
@@ -297,7 +337,7 @@
         </w:rPr>
         <w:t xml:space="preserve"> </w:t>
       </w:r>
-      <w:hyperlink r:id="rId10">
+      <w:hyperlink r:id="rId11">
         <w:r>
           <w:rPr>
             <w:rFonts w:ascii="Times New Roman" w:hAnsi="Times New Roman" w:eastAsia="Times New Roman"/>
@@ -326,7 +366,7 @@
         </w:rPr>
         <w:t xml:space="preserve"> </w:t>
       </w:r>
-      <w:hyperlink r:id="rId11">
+      <w:hyperlink r:id="rId12">
         <w:r>
           <w:rPr>
             <w:rFonts w:ascii="Times New Roman" w:hAnsi="Times New Roman" w:eastAsia="Times New Roman"/>
@@ -348,7 +388,7 @@
       </w:r>
     </w:p>
     <w:p>
-      <w:hyperlink r:id="rId12">
+      <w:hyperlink r:id="rId13">
         <w:r>
           <w:rPr>
             <w:rFonts w:ascii="Times New Roman" w:hAnsi="Times New Roman" w:eastAsia="Times New Roman"/>
@@ -388,7 +428,7 @@
       </w:r>
     </w:p>
     <w:p>
-      <w:hyperlink r:id="rId13">
+      <w:hyperlink r:id="rId14">
         <w:r>
           <w:rPr>
             <w:rFonts w:ascii="Times New Roman" w:hAnsi="Times New Roman" w:eastAsia="Times New Roman"/>
@@ -428,7 +468,7 @@
       </w:r>
     </w:p>
     <w:p>
-      <w:hyperlink r:id="rId14">
+      <w:hyperlink r:id="rId15">
         <w:r>
           <w:rPr>
             <w:rFonts w:ascii="Times New Roman" w:hAnsi="Times New Roman" w:eastAsia="Times New Roman"/>
@@ -468,7 +508,7 @@
       </w:r>
     </w:p>
     <w:p>
-      <w:hyperlink r:id="rId15">
+      <w:hyperlink r:id="rId16">
         <w:r>
           <w:rPr>
             <w:rFonts w:ascii="Times New Roman" w:hAnsi="Times New Roman" w:eastAsia="Times New Roman"/>
@@ -554,6 +594,20 @@
           <w:i w:val="0"/>
           <w:sz w:val="22"/>
         </w:rPr>
+        <w:t>The annual UNODC Youth Forum is a separate route: Member States nominate young participants through their Permanent Missions, UNODC selects them and they attend in their personal capacity rather than as members of a national delegation.</w:t>
+      </w:r>
+    </w:p>
+    <w:p>
+      <w:pPr>
+        <w:pStyle w:val="ListBullet"/>
+      </w:pPr>
+      <w:r>
+        <w:rPr>
+          <w:rFonts w:ascii="Times New Roman" w:hAnsi="Times New Roman" w:eastAsia="Times New Roman"/>
+          <w:b w:val="0"/>
+          <w:i w:val="0"/>
+          <w:sz w:val="22"/>
+        </w:rPr>
         <w:t>The independent panel created by resolution 68/6 must also consult youth groups. That stakeholder route is separate from participation as a member of a national delegation.</w:t>
       </w:r>
     </w:p>
@@ -563,6 +617,29 @@
       </w:pPr>
       <w:r>
         <w:t>Session structure</w:t>
+      </w:r>
+    </w:p>
+    <w:p>
+      <w:pPr>
+        <w:pStyle w:val="ListBullet"/>
+      </w:pPr>
+      <w:r>
+        <w:rPr>
+          <w:rFonts w:ascii="Times New Roman" w:hAnsi="Times New Roman" w:eastAsia="Times New Roman"/>
+          <w:b/>
+          <w:i w:val="0"/>
+          <w:sz w:val="22"/>
+        </w:rPr>
+        <w:t xml:space="preserve">Previous summer onward — UNODC Youth Forum nominations: </w:t>
+      </w:r>
+      <w:r>
+        <w:rPr>
+          <w:rFonts w:ascii="Times New Roman" w:hAnsi="Times New Roman" w:eastAsia="Times New Roman"/>
+          <w:b w:val="0"/>
+          <w:i w:val="0"/>
+          <w:sz w:val="22"/>
+        </w:rPr>
+        <w:t>Member State nominations through Permanent Missions; timing and selection are separate from the CND delegation</w:t>
       </w:r>
     </w:p>
     <w:p>
@@ -810,6 +887,96 @@
     </w:p>
     <w:p>
       <w:pPr>
+        <w:pStyle w:val="Heading2"/>
+      </w:pPr>
+      <w:r>
+        <w:t>2027 file watch</w:t>
+      </w:r>
+    </w:p>
+    <w:p>
+      <w:r>
+        <w:rPr>
+          <w:rFonts w:ascii="Times New Roman" w:hAnsi="Times New Roman" w:eastAsia="Times New Roman"/>
+          <w:b/>
+          <w:i w:val="0"/>
+          <w:sz w:val="22"/>
+        </w:rPr>
+        <w:t xml:space="preserve">Published: </w:t>
+      </w:r>
+      <w:r>
+        <w:rPr>
+          <w:rFonts w:ascii="Times New Roman" w:hAnsi="Times New Roman" w:eastAsia="Times New Roman"/>
+          <w:b w:val="0"/>
+          <w:i w:val="0"/>
+          <w:sz w:val="22"/>
+        </w:rPr>
+        <w:t>Official provisional dates and the CND70 return of the resolution 68/6 expert-panel recommendations are known.</w:t>
+      </w:r>
+    </w:p>
+    <w:p>
+      <w:r>
+        <w:rPr>
+          <w:rFonts w:ascii="Times New Roman" w:hAnsi="Times New Roman" w:eastAsia="Times New Roman"/>
+          <w:b/>
+          <w:i w:val="0"/>
+          <w:sz w:val="22"/>
+        </w:rPr>
+        <w:t xml:space="preserve">Expected next: </w:t>
+      </w:r>
+      <w:r>
+        <w:rPr>
+          <w:rFonts w:ascii="Times New Roman" w:hAnsi="Times New Roman" w:eastAsia="Times New Roman"/>
+          <w:b w:val="0"/>
+          <w:i w:val="0"/>
+          <w:sz w:val="22"/>
+        </w:rPr>
+        <w:t>The UNODC Youth Forum nomination invitation, Bureau-endorsed tabling deadline, draft-resolution list and panel consultation details.</w:t>
+      </w:r>
+    </w:p>
+    <w:p>
+      <w:r>
+        <w:rPr>
+          <w:rFonts w:ascii="Times New Roman" w:hAnsi="Times New Roman" w:eastAsia="Times New Roman"/>
+          <w:b/>
+          <w:i w:val="0"/>
+          <w:sz w:val="22"/>
+        </w:rPr>
+        <w:t xml:space="preserve">Official page: </w:t>
+      </w:r>
+      <w:hyperlink r:id="rId17">
+        <w:r>
+          <w:rPr>
+            <w:rFonts w:ascii="Times New Roman" w:hAnsi="Times New Roman" w:eastAsia="Times New Roman"/>
+            <w:sz w:val="22"/>
+            <w:color w:val="0563C1"/>
+            <w:u w:val="single"/>
+          </w:rPr>
+          <w:t>CND sessions</w:t>
+        </w:r>
+      </w:hyperlink>
+    </w:p>
+    <w:p>
+      <w:r>
+        <w:rPr>
+          <w:rFonts w:ascii="Times New Roman" w:hAnsi="Times New Roman" w:eastAsia="Times New Roman"/>
+          <w:b/>
+          <w:i w:val="0"/>
+          <w:sz w:val="22"/>
+        </w:rPr>
+        <w:t xml:space="preserve">Practical route: </w:t>
+      </w:r>
+      <w:r>
+        <w:rPr>
+          <w:rFonts w:ascii="Times New Roman" w:hAnsi="Times New Roman" w:eastAsia="Times New Roman"/>
+          <w:b w:val="0"/>
+          <w:i w:val="0"/>
+          <w:sz w:val="22"/>
+        </w:rPr>
+        <w:t>Ask your country’s Permanent Mission in Vienna about Youth Forum nominations and the resolution files it expects to sponsor or follow.</w:t>
+      </w:r>
+    </w:p>
+    <w:p>
+      <w:pPr>
         <w:pStyle w:val="Heading1"/>
       </w:pPr>
       <w:r>
@@ -952,7 +1119,7 @@
       <w:pPr>
         <w:pStyle w:val="ListBullet"/>
       </w:pPr>
-      <w:hyperlink r:id="rId16">
+      <w:hyperlink r:id="rId18">
         <w:r>
           <w:rPr>
             <w:rFonts w:ascii="Times New Roman" w:hAnsi="Times New Roman" w:eastAsia="Times New Roman"/>
@@ -977,7 +1144,7 @@
       <w:pPr>
         <w:pStyle w:val="ListBullet"/>
       </w:pPr>
-      <w:hyperlink r:id="rId17">
+      <w:hyperlink r:id="rId19">
         <w:r>
           <w:rPr>
             <w:rFonts w:ascii="Times New Roman" w:hAnsi="Times New Roman" w:eastAsia="Times New Roman"/>
@@ -1017,9 +1184,43 @@
           <w:i w:val="0"/>
           <w:sz w:val="22"/>
         </w:rPr>
+        <w:t xml:space="preserve">Previous summer onward · when invited — </w:t>
+      </w:r>
+      <w:hyperlink r:id="rId9">
+        <w:r>
+          <w:rPr>
+            <w:rFonts w:ascii="Times New Roman" w:hAnsi="Times New Roman" w:eastAsia="Times New Roman"/>
+            <w:sz w:val="22"/>
+            <w:color w:val="0563C1"/>
+            <w:u w:val="single"/>
+          </w:rPr>
+          <w:t>UNODC Youth Forum nomination</w:t>
+        </w:r>
+      </w:hyperlink>
+      <w:r>
+        <w:rPr>
+          <w:rFonts w:ascii="Times New Roman" w:hAnsi="Times New Roman" w:eastAsia="Times New Roman"/>
+          <w:b w:val="0"/>
+          <w:i w:val="0"/>
+          <w:sz w:val="22"/>
+        </w:rPr>
+        <w:t>: Ask your country’s Permanent Mission in Vienna whether the nomination invitation has arrived. The Forum is organized by UNODC with ongoing support from the Government of the Russian Federation; participants are selected by UNODC and attend in their personal capacity. Its collective youth statement is delivered to CND, but this is not the CND resolution-negotiation route.</w:t>
+      </w:r>
+    </w:p>
+    <w:p>
+      <w:pPr>
+        <w:pStyle w:val="ListBullet"/>
+      </w:pPr>
+      <w:r>
+        <w:rPr>
+          <w:rFonts w:ascii="Times New Roman" w:hAnsi="Times New Roman" w:eastAsia="Times New Roman"/>
+          <w:b/>
+          <w:i w:val="0"/>
+          <w:sz w:val="22"/>
+        </w:rPr>
         <w:t xml:space="preserve">When a panel consultation is announced — </w:t>
       </w:r>
-      <w:hyperlink r:id="rId13">
+      <w:hyperlink r:id="rId14">
         <w:r>
           <w:rPr>
             <w:rFonts w:ascii="Times New Roman" w:hAnsi="Times New Roman" w:eastAsia="Times New Roman"/>
@@ -1085,7 +1286,7 @@
         </w:rPr>
         <w:t xml:space="preserve">Around 15 February 2027 · to confirm — </w:t>
       </w:r>
-      <w:hyperlink r:id="rId15">
+      <w:hyperlink r:id="rId16">
         <w:r>
           <w:rPr>
             <w:rFonts w:ascii="Times New Roman" w:hAnsi="Times New Roman" w:eastAsia="Times New Roman"/>
@@ -1119,7 +1320,7 @@
         </w:rPr>
         <w:t xml:space="preserve">After the L-documents appear — </w:t>
       </w:r>
-      <w:hyperlink r:id="rId12">
+      <w:hyperlink r:id="rId13">
         <w:r>
           <w:rPr>
             <w:rFonts w:ascii="Times New Roman" w:hAnsi="Times New Roman" w:eastAsia="Times New Roman"/>
@@ -1222,7 +1423,7 @@
         </w:rPr>
         <w:t xml:space="preserve">Initiative — </w:t>
       </w:r>
-      <w:hyperlink r:id="rId18">
+      <w:hyperlink r:id="rId20">
         <w:r>
           <w:rPr>
             <w:rFonts w:ascii="Times New Roman" w:hAnsi="Times New Roman" w:eastAsia="Times New Roman"/>
@@ -1273,7 +1474,7 @@
         </w:rPr>
         <w:t xml:space="preserve">CND session, documentation and organizational enquiries — </w:t>
       </w:r>
-      <w:hyperlink r:id="rId19">
+      <w:hyperlink r:id="rId21">
         <w:r>
           <w:rPr>
             <w:rFonts w:ascii="Times New Roman" w:hAnsi="Times New Roman" w:eastAsia="Times New Roman"/>
@@ -1307,7 +1508,7 @@
         </w:rPr>
         <w:t xml:space="preserve">UNODC Youth Focal Point — </w:t>
       </w:r>
-      <w:hyperlink r:id="rId20">
+      <w:hyperlink r:id="rId22">
         <w:r>
           <w:rPr>
             <w:rFonts w:ascii="Times New Roman" w:hAnsi="Times New Roman" w:eastAsia="Times New Roman"/>
@@ -1341,7 +1542,7 @@
         </w:rPr>
         <w:t xml:space="preserve">Former Austrian UN Youth Delegate · CND participation and peer contact — </w:t>
       </w:r>
-      <w:hyperlink r:id="rId21">
+      <w:hyperlink r:id="rId23">
         <w:r>
           <w:rPr>
             <w:rFonts w:ascii="Times New Roman" w:hAnsi="Times New Roman" w:eastAsia="Times New Roman"/>
@@ -1383,7 +1584,7 @@
         </w:rPr>
         <w:t xml:space="preserve">General youth-affairs and meaningful-participation enquiries — </w:t>
       </w:r>
-      <w:hyperlink r:id="rId22">
+      <w:hyperlink r:id="rId24">
         <w:r>
           <w:rPr>
             <w:rFonts w:ascii="Times New Roman" w:hAnsi="Times New Roman" w:eastAsia="Times New Roman"/>
@@ -1417,7 +1618,7 @@
         </w:rPr>
         <w:t xml:space="preserve">UN Youth Delegate Programme and UN youth-system routing — </w:t>
       </w:r>
-      <w:hyperlink r:id="rId23">
+      <w:hyperlink r:id="rId25">
         <w:r>
           <w:rPr>
             <w:rFonts w:ascii="Times New Roman" w:hAnsi="Times New Roman" w:eastAsia="Times New Roman"/>
@@ -1451,7 +1652,7 @@
         </w:rPr>
         <w:t xml:space="preserve">Peer-run coordination mailbox for current UN Youth Delegates — </w:t>
       </w:r>
-      <w:hyperlink r:id="rId24">
+      <w:hyperlink r:id="rId26">
         <w:r>
           <w:rPr>
             <w:rFonts w:ascii="Times New Roman" w:hAnsi="Times New Roman" w:eastAsia="Times New Roman"/>
@@ -1475,7 +1676,7 @@
       <w:pPr>
         <w:pStyle w:val="ListBullet"/>
       </w:pPr>
-      <w:hyperlink r:id="rId25">
+      <w:hyperlink r:id="rId27">
         <w:r>
           <w:rPr>
             <w:rFonts w:ascii="Times New Roman" w:hAnsi="Times New Roman" w:eastAsia="Times New Roman"/>
@@ -1491,7 +1692,23 @@
       <w:pPr>
         <w:pStyle w:val="ListBullet"/>
       </w:pPr>
-      <w:hyperlink r:id="rId26">
+      <w:hyperlink r:id="rId9">
+        <w:r>
+          <w:rPr>
+            <w:rFonts w:ascii="Times New Roman" w:hAnsi="Times New Roman" w:eastAsia="Times New Roman"/>
+            <w:sz w:val="22"/>
+            <w:color w:val="0563C1"/>
+            <w:u w:val="single"/>
+          </w:rPr>
+          <w:t>UNODC Youth Forum 2025 report</w:t>
+        </w:r>
+      </w:hyperlink>
+    </w:p>
+    <w:p>
+      <w:pPr>
+        <w:pStyle w:val="ListBullet"/>
+      </w:pPr>
+      <w:hyperlink r:id="rId28">
         <w:r>
           <w:rPr>
             <w:rFonts w:ascii="Times New Roman" w:hAnsi="Times New Roman" w:eastAsia="Times New Roman"/>
@@ -1507,7 +1724,7 @@
       <w:pPr>
         <w:pStyle w:val="ListBullet"/>
       </w:pPr>
-      <w:hyperlink r:id="rId9">
+      <w:hyperlink r:id="rId10">
         <w:r>
           <w:rPr>
             <w:rFonts w:ascii="Times New Roman" w:hAnsi="Times New Roman" w:eastAsia="Times New Roman"/>
@@ -1523,7 +1740,7 @@
       <w:pPr>
         <w:pStyle w:val="ListBullet"/>
       </w:pPr>
-      <w:hyperlink r:id="rId10">
+      <w:hyperlink r:id="rId11">
         <w:r>
           <w:rPr>
             <w:rFonts w:ascii="Times New Roman" w:hAnsi="Times New Roman" w:eastAsia="Times New Roman"/>
@@ -1539,7 +1756,7 @@
       <w:pPr>
         <w:pStyle w:val="ListBullet"/>
       </w:pPr>
-      <w:hyperlink r:id="rId11">
+      <w:hyperlink r:id="rId12">
         <w:r>
           <w:rPr>
             <w:rFonts w:ascii="Times New Roman" w:hAnsi="Times New Roman" w:eastAsia="Times New Roman"/>
@@ -1555,7 +1772,7 @@
       <w:pPr>
         <w:pStyle w:val="ListBullet"/>
       </w:pPr>
-      <w:hyperlink r:id="rId13">
+      <w:hyperlink r:id="rId14">
         <w:r>
           <w:rPr>
             <w:rFonts w:ascii="Times New Roman" w:hAnsi="Times New Roman" w:eastAsia="Times New Roman"/>
@@ -1571,7 +1788,7 @@
       <w:pPr>
         <w:pStyle w:val="ListBullet"/>
       </w:pPr>
-      <w:hyperlink r:id="rId12">
+      <w:hyperlink r:id="rId13">
         <w:r>
           <w:rPr>
             <w:rFonts w:ascii="Times New Roman" w:hAnsi="Times New Roman" w:eastAsia="Times New Roman"/>
@@ -1587,7 +1804,7 @@
       <w:pPr>
         <w:pStyle w:val="ListBullet"/>
       </w:pPr>
-      <w:hyperlink r:id="rId15">
+      <w:hyperlink r:id="rId16">
         <w:r>
           <w:rPr>
             <w:rFonts w:ascii="Times New Roman" w:hAnsi="Times New Roman" w:eastAsia="Times New Roman"/>
@@ -1603,7 +1820,7 @@
       <w:pPr>
         <w:pStyle w:val="ListBullet"/>
       </w:pPr>
-      <w:hyperlink r:id="rId27">
+      <w:hyperlink r:id="rId29">
         <w:r>
           <w:rPr>
             <w:rFonts w:ascii="Times New Roman" w:hAnsi="Times New Roman" w:eastAsia="Times New Roman"/>

</xml_diff>

<commit_message>
Clarify CND Youth Forum context
</commit_message>
<xml_diff>
--- a/public/downloads/process-briefs/cnd-prose-brief.docx
+++ b/public/downloads/process-briefs/cnd-prose-brief.docx
@@ -250,7 +250,7 @@
           <w:i w:val="0"/>
           <w:sz w:val="22"/>
         </w:rPr>
-        <w:t>. UNODC organizes the Forum with ongoing support from the Government of the Russian Federation. It is not a UN Youth Delegate forum: Member States nominate participants through their Permanent Missions, UNODC selects them and they participate in their personal capacity. Some UN Youth Delegates have participated, but the official reports do not consistently identify UNYD status. The Forum produces a collective youth statement delivered to CND.</w:t>
+        <w:t>. The UNODC forum is seemingly organised and largely financed by Russia. UNYD participation is very rare.</w:t>
       </w:r>
       <w:r>
         <w:rPr>
@@ -1204,7 +1204,7 @@
           <w:i w:val="0"/>
           <w:sz w:val="22"/>
         </w:rPr>
-        <w:t>: Ask your country’s Permanent Mission in Vienna whether the nomination invitation has arrived. The Forum is organized by UNODC with ongoing support from the Government of the Russian Federation; participants are selected by UNODC and attend in their personal capacity. Its collective youth statement is delivered to CND, but this is not the CND resolution-negotiation route.</w:t>
+        <w:t>: The UNODC forum is seemingly organised and largely financed by Russia. UNYD participation is very rare. Ask your country’s Permanent Mission in Vienna whether the nomination invitation has arrived; selected participants attend in their personal capacity, and the resulting collective youth statement is delivered to CND rather than negotiated as a CND resolution.</w:t>
       </w:r>
     </w:p>
     <w:p>

</xml_diff>

<commit_message>
Add practical HRC guidance and 2027 resolution forecast
</commit_message>
<xml_diff>
--- a/public/downloads/process-briefs/cnd-prose-brief.docx
+++ b/public/downloads/process-briefs/cnd-prose-brief.docx
@@ -93,7 +93,7 @@
           <w:i w:val="0"/>
           <w:sz w:val="22"/>
         </w:rPr>
-        <w:t>28 August 2026</w:t>
+        <w:t>29 August 2026</w:t>
       </w:r>
     </w:p>
     <w:p>
@@ -211,7 +211,7 @@
           <w:i w:val="0"/>
           <w:sz w:val="22"/>
         </w:rPr>
-        <w:t>CND does not have one recurring youth resolution. Two separate youth-specific openings are the annual UNODC Youth Forum and the independent expert panel established by resolution 68/6, which must consult youth groups and return to CND70 in 2027.</w:t>
+        <w:t>CND does not have one recurring youth resolution. The clearest current youth-specific opening is the independent expert panel established by resolution 68/6: it must consult youth groups and its recommendations are due for discussion at CND70 in 2027.</w:t>
       </w:r>
     </w:p>
     <w:p>
@@ -220,46 +220,6 @@
       </w:pPr>
       <w:r>
         <w:t>Recurring entry points</w:t>
-      </w:r>
-    </w:p>
-    <w:p>
-      <w:hyperlink r:id="rId9">
-        <w:r>
-          <w:rPr>
-            <w:rFonts w:ascii="Times New Roman" w:hAnsi="Times New Roman" w:eastAsia="Times New Roman"/>
-            <w:sz w:val="22"/>
-            <w:color w:val="0563C1"/>
-            <w:u w:val="single"/>
-          </w:rPr>
-          <w:t>Annual UNODC Youth Forum</w:t>
-        </w:r>
-      </w:hyperlink>
-      <w:r>
-        <w:rPr>
-          <w:rFonts w:ascii="Times New Roman" w:hAnsi="Times New Roman" w:eastAsia="Times New Roman"/>
-          <w:b/>
-          <w:i w:val="0"/>
-          <w:sz w:val="22"/>
-        </w:rPr>
-        <w:t xml:space="preserve"> — Nomination can begin in the previous summer · event around CND</w:t>
-      </w:r>
-      <w:r>
-        <w:rPr>
-          <w:rFonts w:ascii="Times New Roman" w:hAnsi="Times New Roman" w:eastAsia="Times New Roman"/>
-          <w:b w:val="0"/>
-          <w:i w:val="0"/>
-          <w:sz w:val="22"/>
-        </w:rPr>
-        <w:t>. The UNODC forum is seemingly organised and largely financed by Russia. UNYD participation is very rare.</w:t>
-      </w:r>
-      <w:r>
-        <w:rPr>
-          <w:rFonts w:ascii="Times New Roman" w:hAnsi="Times New Roman" w:eastAsia="Times New Roman"/>
-          <w:b w:val="0"/>
-          <w:i/>
-          <w:sz w:val="22"/>
-        </w:rPr>
-        <w:t xml:space="preserve"> Status: Annual adjacent participation route; 2027 nomination pending.</w:t>
       </w:r>
     </w:p>
     <w:p>
@@ -308,7 +268,7 @@
         </w:rPr>
         <w:t xml:space="preserve"> </w:t>
       </w:r>
-      <w:hyperlink r:id="rId10">
+      <w:hyperlink r:id="rId9">
         <w:r>
           <w:rPr>
             <w:rFonts w:ascii="Times New Roman" w:hAnsi="Times New Roman" w:eastAsia="Times New Roman"/>
@@ -337,7 +297,7 @@
         </w:rPr>
         <w:t xml:space="preserve"> </w:t>
       </w:r>
-      <w:hyperlink r:id="rId11">
+      <w:hyperlink r:id="rId10">
         <w:r>
           <w:rPr>
             <w:rFonts w:ascii="Times New Roman" w:hAnsi="Times New Roman" w:eastAsia="Times New Roman"/>
@@ -366,7 +326,7 @@
         </w:rPr>
         <w:t xml:space="preserve"> </w:t>
       </w:r>
-      <w:hyperlink r:id="rId12">
+      <w:hyperlink r:id="rId11">
         <w:r>
           <w:rPr>
             <w:rFonts w:ascii="Times New Roman" w:hAnsi="Times New Roman" w:eastAsia="Times New Roman"/>
@@ -388,7 +348,7 @@
       </w:r>
     </w:p>
     <w:p>
-      <w:hyperlink r:id="rId13">
+      <w:hyperlink r:id="rId12">
         <w:r>
           <w:rPr>
             <w:rFonts w:ascii="Times New Roman" w:hAnsi="Times New Roman" w:eastAsia="Times New Roman"/>
@@ -428,7 +388,7 @@
       </w:r>
     </w:p>
     <w:p>
-      <w:hyperlink r:id="rId14">
+      <w:hyperlink r:id="rId13">
         <w:r>
           <w:rPr>
             <w:rFonts w:ascii="Times New Roman" w:hAnsi="Times New Roman" w:eastAsia="Times New Roman"/>
@@ -468,7 +428,7 @@
       </w:r>
     </w:p>
     <w:p>
-      <w:hyperlink r:id="rId15">
+      <w:hyperlink r:id="rId14">
         <w:r>
           <w:rPr>
             <w:rFonts w:ascii="Times New Roman" w:hAnsi="Times New Roman" w:eastAsia="Times New Roman"/>
@@ -508,7 +468,7 @@
       </w:r>
     </w:p>
     <w:p>
-      <w:hyperlink r:id="rId16">
+      <w:hyperlink r:id="rId15">
         <w:r>
           <w:rPr>
             <w:rFonts w:ascii="Times New Roman" w:hAnsi="Times New Roman" w:eastAsia="Times New Roman"/>
@@ -594,20 +554,6 @@
           <w:i w:val="0"/>
           <w:sz w:val="22"/>
         </w:rPr>
-        <w:t>The annual UNODC Youth Forum is a separate route: Member States nominate young participants through their Permanent Missions, UNODC selects them and they attend in their personal capacity rather than as members of a national delegation.</w:t>
-      </w:r>
-    </w:p>
-    <w:p>
-      <w:pPr>
-        <w:pStyle w:val="ListBullet"/>
-      </w:pPr>
-      <w:r>
-        <w:rPr>
-          <w:rFonts w:ascii="Times New Roman" w:hAnsi="Times New Roman" w:eastAsia="Times New Roman"/>
-          <w:b w:val="0"/>
-          <w:i w:val="0"/>
-          <w:sz w:val="22"/>
-        </w:rPr>
         <w:t>The independent panel created by resolution 68/6 must also consult youth groups. That stakeholder route is separate from participation as a member of a national delegation.</w:t>
       </w:r>
     </w:p>
@@ -617,29 +563,6 @@
       </w:pPr>
       <w:r>
         <w:t>Session structure</w:t>
-      </w:r>
-    </w:p>
-    <w:p>
-      <w:pPr>
-        <w:pStyle w:val="ListBullet"/>
-      </w:pPr>
-      <w:r>
-        <w:rPr>
-          <w:rFonts w:ascii="Times New Roman" w:hAnsi="Times New Roman" w:eastAsia="Times New Roman"/>
-          <w:b/>
-          <w:i w:val="0"/>
-          <w:sz w:val="22"/>
-        </w:rPr>
-        <w:t xml:space="preserve">Previous summer onward — UNODC Youth Forum nominations: </w:t>
-      </w:r>
-      <w:r>
-        <w:rPr>
-          <w:rFonts w:ascii="Times New Roman" w:hAnsi="Times New Roman" w:eastAsia="Times New Roman"/>
-          <w:b w:val="0"/>
-          <w:i w:val="0"/>
-          <w:sz w:val="22"/>
-        </w:rPr>
-        <w:t>Member State nominations through Permanent Missions; timing and selection are separate from the CND delegation</w:t>
       </w:r>
     </w:p>
     <w:p>
@@ -887,96 +810,6 @@
     </w:p>
     <w:p>
       <w:pPr>
-        <w:pStyle w:val="Heading2"/>
-      </w:pPr>
-      <w:r>
-        <w:t>2027 file watch</w:t>
-      </w:r>
-    </w:p>
-    <w:p>
-      <w:r>
-        <w:rPr>
-          <w:rFonts w:ascii="Times New Roman" w:hAnsi="Times New Roman" w:eastAsia="Times New Roman"/>
-          <w:b/>
-          <w:i w:val="0"/>
-          <w:sz w:val="22"/>
-        </w:rPr>
-        <w:t xml:space="preserve">Published: </w:t>
-      </w:r>
-      <w:r>
-        <w:rPr>
-          <w:rFonts w:ascii="Times New Roman" w:hAnsi="Times New Roman" w:eastAsia="Times New Roman"/>
-          <w:b w:val="0"/>
-          <w:i w:val="0"/>
-          <w:sz w:val="22"/>
-        </w:rPr>
-        <w:t>Official provisional dates and the CND70 return of the resolution 68/6 expert-panel recommendations are known.</w:t>
-      </w:r>
-    </w:p>
-    <w:p>
-      <w:r>
-        <w:rPr>
-          <w:rFonts w:ascii="Times New Roman" w:hAnsi="Times New Roman" w:eastAsia="Times New Roman"/>
-          <w:b/>
-          <w:i w:val="0"/>
-          <w:sz w:val="22"/>
-        </w:rPr>
-        <w:t xml:space="preserve">Expected next: </w:t>
-      </w:r>
-      <w:r>
-        <w:rPr>
-          <w:rFonts w:ascii="Times New Roman" w:hAnsi="Times New Roman" w:eastAsia="Times New Roman"/>
-          <w:b w:val="0"/>
-          <w:i w:val="0"/>
-          <w:sz w:val="22"/>
-        </w:rPr>
-        <w:t>The UNODC Youth Forum nomination invitation, Bureau-endorsed tabling deadline, draft-resolution list and panel consultation details.</w:t>
-      </w:r>
-    </w:p>
-    <w:p>
-      <w:r>
-        <w:rPr>
-          <w:rFonts w:ascii="Times New Roman" w:hAnsi="Times New Roman" w:eastAsia="Times New Roman"/>
-          <w:b/>
-          <w:i w:val="0"/>
-          <w:sz w:val="22"/>
-        </w:rPr>
-        <w:t xml:space="preserve">Official page: </w:t>
-      </w:r>
-      <w:hyperlink r:id="rId17">
-        <w:r>
-          <w:rPr>
-            <w:rFonts w:ascii="Times New Roman" w:hAnsi="Times New Roman" w:eastAsia="Times New Roman"/>
-            <w:sz w:val="22"/>
-            <w:color w:val="0563C1"/>
-            <w:u w:val="single"/>
-          </w:rPr>
-          <w:t>CND sessions</w:t>
-        </w:r>
-      </w:hyperlink>
-    </w:p>
-    <w:p>
-      <w:r>
-        <w:rPr>
-          <w:rFonts w:ascii="Times New Roman" w:hAnsi="Times New Roman" w:eastAsia="Times New Roman"/>
-          <w:b/>
-          <w:i w:val="0"/>
-          <w:sz w:val="22"/>
-        </w:rPr>
-        <w:t xml:space="preserve">Practical route: </w:t>
-      </w:r>
-      <w:r>
-        <w:rPr>
-          <w:rFonts w:ascii="Times New Roman" w:hAnsi="Times New Roman" w:eastAsia="Times New Roman"/>
-          <w:b w:val="0"/>
-          <w:i w:val="0"/>
-          <w:sz w:val="22"/>
-        </w:rPr>
-        <w:t>Ask your country’s Permanent Mission in Vienna about Youth Forum nominations and the resolution files it expects to sponsor or follow.</w:t>
-      </w:r>
-    </w:p>
-    <w:p>
-      <w:pPr>
         <w:pStyle w:val="Heading1"/>
       </w:pPr>
       <w:r>
@@ -1119,7 +952,7 @@
       <w:pPr>
         <w:pStyle w:val="ListBullet"/>
       </w:pPr>
-      <w:hyperlink r:id="rId18">
+      <w:hyperlink r:id="rId16">
         <w:r>
           <w:rPr>
             <w:rFonts w:ascii="Times New Roman" w:hAnsi="Times New Roman" w:eastAsia="Times New Roman"/>
@@ -1144,7 +977,7 @@
       <w:pPr>
         <w:pStyle w:val="ListBullet"/>
       </w:pPr>
-      <w:hyperlink r:id="rId19">
+      <w:hyperlink r:id="rId17">
         <w:r>
           <w:rPr>
             <w:rFonts w:ascii="Times New Roman" w:hAnsi="Times New Roman" w:eastAsia="Times New Roman"/>
@@ -1184,43 +1017,9 @@
           <w:i w:val="0"/>
           <w:sz w:val="22"/>
         </w:rPr>
-        <w:t xml:space="preserve">Previous summer onward · when invited — </w:t>
-      </w:r>
-      <w:hyperlink r:id="rId9">
-        <w:r>
-          <w:rPr>
-            <w:rFonts w:ascii="Times New Roman" w:hAnsi="Times New Roman" w:eastAsia="Times New Roman"/>
-            <w:sz w:val="22"/>
-            <w:color w:val="0563C1"/>
-            <w:u w:val="single"/>
-          </w:rPr>
-          <w:t>UNODC Youth Forum nomination</w:t>
-        </w:r>
-      </w:hyperlink>
-      <w:r>
-        <w:rPr>
-          <w:rFonts w:ascii="Times New Roman" w:hAnsi="Times New Roman" w:eastAsia="Times New Roman"/>
-          <w:b w:val="0"/>
-          <w:i w:val="0"/>
-          <w:sz w:val="22"/>
-        </w:rPr>
-        <w:t>: The UNODC forum is seemingly organised and largely financed by Russia. UNYD participation is very rare. Ask your country’s Permanent Mission in Vienna whether the nomination invitation has arrived; selected participants attend in their personal capacity, and the resulting collective youth statement is delivered to CND rather than negotiated as a CND resolution.</w:t>
-      </w:r>
-    </w:p>
-    <w:p>
-      <w:pPr>
-        <w:pStyle w:val="ListBullet"/>
-      </w:pPr>
-      <w:r>
-        <w:rPr>
-          <w:rFonts w:ascii="Times New Roman" w:hAnsi="Times New Roman" w:eastAsia="Times New Roman"/>
-          <w:b/>
-          <w:i w:val="0"/>
-          <w:sz w:val="22"/>
-        </w:rPr>
         <w:t xml:space="preserve">When a panel consultation is announced — </w:t>
       </w:r>
-      <w:hyperlink r:id="rId14">
+      <w:hyperlink r:id="rId13">
         <w:r>
           <w:rPr>
             <w:rFonts w:ascii="Times New Roman" w:hAnsi="Times New Roman" w:eastAsia="Times New Roman"/>
@@ -1286,7 +1085,7 @@
         </w:rPr>
         <w:t xml:space="preserve">Around 15 February 2027 · to confirm — </w:t>
       </w:r>
-      <w:hyperlink r:id="rId16">
+      <w:hyperlink r:id="rId15">
         <w:r>
           <w:rPr>
             <w:rFonts w:ascii="Times New Roman" w:hAnsi="Times New Roman" w:eastAsia="Times New Roman"/>
@@ -1320,7 +1119,7 @@
         </w:rPr>
         <w:t xml:space="preserve">After the L-documents appear — </w:t>
       </w:r>
-      <w:hyperlink r:id="rId13">
+      <w:hyperlink r:id="rId12">
         <w:r>
           <w:rPr>
             <w:rFonts w:ascii="Times New Roman" w:hAnsi="Times New Roman" w:eastAsia="Times New Roman"/>
@@ -1423,7 +1222,7 @@
         </w:rPr>
         <w:t xml:space="preserve">Initiative — </w:t>
       </w:r>
-      <w:hyperlink r:id="rId20">
+      <w:hyperlink r:id="rId18">
         <w:r>
           <w:rPr>
             <w:rFonts w:ascii="Times New Roman" w:hAnsi="Times New Roman" w:eastAsia="Times New Roman"/>
@@ -1474,7 +1273,7 @@
         </w:rPr>
         <w:t xml:space="preserve">CND session, documentation and organizational enquiries — </w:t>
       </w:r>
-      <w:hyperlink r:id="rId21">
+      <w:hyperlink r:id="rId19">
         <w:r>
           <w:rPr>
             <w:rFonts w:ascii="Times New Roman" w:hAnsi="Times New Roman" w:eastAsia="Times New Roman"/>
@@ -1508,7 +1307,7 @@
         </w:rPr>
         <w:t xml:space="preserve">UNODC Youth Focal Point — </w:t>
       </w:r>
-      <w:hyperlink r:id="rId22">
+      <w:hyperlink r:id="rId20">
         <w:r>
           <w:rPr>
             <w:rFonts w:ascii="Times New Roman" w:hAnsi="Times New Roman" w:eastAsia="Times New Roman"/>
@@ -1542,7 +1341,7 @@
         </w:rPr>
         <w:t xml:space="preserve">Former Austrian UN Youth Delegate · CND participation and peer contact — </w:t>
       </w:r>
-      <w:hyperlink r:id="rId23">
+      <w:hyperlink r:id="rId21">
         <w:r>
           <w:rPr>
             <w:rFonts w:ascii="Times New Roman" w:hAnsi="Times New Roman" w:eastAsia="Times New Roman"/>
@@ -1584,7 +1383,7 @@
         </w:rPr>
         <w:t xml:space="preserve">General youth-affairs and meaningful-participation enquiries — </w:t>
       </w:r>
-      <w:hyperlink r:id="rId24">
+      <w:hyperlink r:id="rId22">
         <w:r>
           <w:rPr>
             <w:rFonts w:ascii="Times New Roman" w:hAnsi="Times New Roman" w:eastAsia="Times New Roman"/>
@@ -1618,7 +1417,7 @@
         </w:rPr>
         <w:t xml:space="preserve">UN Youth Delegate Programme and UN youth-system routing — </w:t>
       </w:r>
-      <w:hyperlink r:id="rId25">
+      <w:hyperlink r:id="rId23">
         <w:r>
           <w:rPr>
             <w:rFonts w:ascii="Times New Roman" w:hAnsi="Times New Roman" w:eastAsia="Times New Roman"/>
@@ -1652,7 +1451,7 @@
         </w:rPr>
         <w:t xml:space="preserve">Peer-run coordination mailbox for current UN Youth Delegates — </w:t>
       </w:r>
-      <w:hyperlink r:id="rId26">
+      <w:hyperlink r:id="rId24">
         <w:r>
           <w:rPr>
             <w:rFonts w:ascii="Times New Roman" w:hAnsi="Times New Roman" w:eastAsia="Times New Roman"/>
@@ -1676,7 +1475,7 @@
       <w:pPr>
         <w:pStyle w:val="ListBullet"/>
       </w:pPr>
-      <w:hyperlink r:id="rId27">
+      <w:hyperlink r:id="rId25">
         <w:r>
           <w:rPr>
             <w:rFonts w:ascii="Times New Roman" w:hAnsi="Times New Roman" w:eastAsia="Times New Roman"/>
@@ -1692,23 +1491,7 @@
       <w:pPr>
         <w:pStyle w:val="ListBullet"/>
       </w:pPr>
-      <w:hyperlink r:id="rId9">
-        <w:r>
-          <w:rPr>
-            <w:rFonts w:ascii="Times New Roman" w:hAnsi="Times New Roman" w:eastAsia="Times New Roman"/>
-            <w:sz w:val="22"/>
-            <w:color w:val="0563C1"/>
-            <w:u w:val="single"/>
-          </w:rPr>
-          <w:t>UNODC Youth Forum 2025 report</w:t>
-        </w:r>
-      </w:hyperlink>
-    </w:p>
-    <w:p>
-      <w:pPr>
-        <w:pStyle w:val="ListBullet"/>
-      </w:pPr>
-      <w:hyperlink r:id="rId28">
+      <w:hyperlink r:id="rId26">
         <w:r>
           <w:rPr>
             <w:rFonts w:ascii="Times New Roman" w:hAnsi="Times New Roman" w:eastAsia="Times New Roman"/>
@@ -1724,7 +1507,7 @@
       <w:pPr>
         <w:pStyle w:val="ListBullet"/>
       </w:pPr>
-      <w:hyperlink r:id="rId10">
+      <w:hyperlink r:id="rId9">
         <w:r>
           <w:rPr>
             <w:rFonts w:ascii="Times New Roman" w:hAnsi="Times New Roman" w:eastAsia="Times New Roman"/>
@@ -1740,7 +1523,7 @@
       <w:pPr>
         <w:pStyle w:val="ListBullet"/>
       </w:pPr>
-      <w:hyperlink r:id="rId11">
+      <w:hyperlink r:id="rId10">
         <w:r>
           <w:rPr>
             <w:rFonts w:ascii="Times New Roman" w:hAnsi="Times New Roman" w:eastAsia="Times New Roman"/>
@@ -1756,7 +1539,7 @@
       <w:pPr>
         <w:pStyle w:val="ListBullet"/>
       </w:pPr>
-      <w:hyperlink r:id="rId12">
+      <w:hyperlink r:id="rId11">
         <w:r>
           <w:rPr>
             <w:rFonts w:ascii="Times New Roman" w:hAnsi="Times New Roman" w:eastAsia="Times New Roman"/>
@@ -1772,7 +1555,7 @@
       <w:pPr>
         <w:pStyle w:val="ListBullet"/>
       </w:pPr>
-      <w:hyperlink r:id="rId14">
+      <w:hyperlink r:id="rId13">
         <w:r>
           <w:rPr>
             <w:rFonts w:ascii="Times New Roman" w:hAnsi="Times New Roman" w:eastAsia="Times New Roman"/>
@@ -1788,7 +1571,7 @@
       <w:pPr>
         <w:pStyle w:val="ListBullet"/>
       </w:pPr>
-      <w:hyperlink r:id="rId13">
+      <w:hyperlink r:id="rId12">
         <w:r>
           <w:rPr>
             <w:rFonts w:ascii="Times New Roman" w:hAnsi="Times New Roman" w:eastAsia="Times New Roman"/>
@@ -1804,7 +1587,7 @@
       <w:pPr>
         <w:pStyle w:val="ListBullet"/>
       </w:pPr>
-      <w:hyperlink r:id="rId16">
+      <w:hyperlink r:id="rId15">
         <w:r>
           <w:rPr>
             <w:rFonts w:ascii="Times New Roman" w:hAnsi="Times New Roman" w:eastAsia="Times New Roman"/>
@@ -1820,7 +1603,7 @@
       <w:pPr>
         <w:pStyle w:val="ListBullet"/>
       </w:pPr>
-      <w:hyperlink r:id="rId29">
+      <w:hyperlink r:id="rId27">
         <w:r>
           <w:rPr>
             <w:rFonts w:ascii="Times New Roman" w:hAnsi="Times New Roman" w:eastAsia="Times New Roman"/>

</xml_diff>